<commit_message>
docs: add GitHub links to lab reports
</commit_message>
<xml_diff>
--- a/reports/ЛР3_СЭД_Вариант8.docx
+++ b/reports/ЛР3_СЭД_Вариант8.docx
@@ -95,12 +95,12 @@
     </w:p>
     <w:p>
       <w:r>
-        <w:t>В ходе лабораторной работы был реализован функциональный модуль для системы электронного документооборота. Предметная область продолжает лабораторные работы №1 и №2: система предназначена для создания, хранения, обработки, согласования и поиска документов внутри организации.</w:t>
+        <w:t>В ходе выполнения лабораторной работы был продолжен проект системы электронного документооборота по варианту 8. Система предназначена для создания, хранения, обработки, согласования и поиска документов внутри организации.</w:t>
       </w:r>
     </w:p>
     <w:p>
       <w:r>
-        <w:t>Вариант работы: 8. Тема предметной области: система электронного документооборота (СЭД).</w:t>
+        <w:t>Цель работы — перейти от проектирования к реализации одного функционального модуля, применить принципы чистого кода, использовать паттерн проектирования и оформить проект в системе контроля версий.</w:t>
       </w:r>
     </w:p>
     <w:p>
@@ -113,7 +113,7 @@
     </w:p>
     <w:p>
       <w:r>
-        <w:t>Исходный проект представляет собой настольное приложение на Electron, React и TypeScript. Для хранения данных используется SQLite через библиотеку better-sqlite3. Архитектура проекта разделена на слой представления, слой бизнес-логики и слой доступа к данным.</w:t>
+        <w:t>Проект представляет собой настольное приложение на Electron, React и TypeScript. Для хранения данных используется SQLite. Архитектура проекта соответствует многоуровневому подходу, выбранному в лабораторной работе №2.</w:t>
       </w:r>
     </w:p>
     <w:tbl>
@@ -144,7 +144,7 @@
           </w:tcPr>
           <w:p>
             <w:r>
-              <w:t>Реализация в проекте</w:t>
+              <w:t>Реализация</w:t>
             </w:r>
           </w:p>
         </w:tc>
@@ -166,7 +166,7 @@
           </w:tcPr>
           <w:p>
             <w:r>
-              <w:t>React-компоненты и страницы в src/renderer</w:t>
+              <w:t>React-страницы и компоненты в src/renderer</w:t>
             </w:r>
           </w:p>
         </w:tc>
@@ -232,7 +232,7 @@
           </w:tcPr>
           <w:p>
             <w:r>
-              <w:t>SQLite, Electron IPC, миграции базы данных</w:t>
+              <w:t>SQLite, Electron IPC и миграции базы данных</w:t>
             </w:r>
           </w:p>
         </w:tc>
@@ -249,7 +249,12 @@
     </w:p>
     <w:p>
       <w:r>
-        <w:t>Для реализации был выбран модуль согласования документов ApprovalModule. Выбор связан с тем, что в лабораторной работе №2 ключевым сценарием системы был определен процесс отправки документа на согласование.</w:t>
+        <w:t>Для реализации был выбран модуль согласования документов ApprovalModule. Этот выбор связан с результатами лабораторной работы №2, где ключевым сценарием был выбран процесс отправки документа на согласование.</w:t>
+      </w:r>
+    </w:p>
+    <w:p>
+      <w:r>
+        <w:t>Модуль согласования является важной частью СЭД, так как он управляет изменением статуса документа и определяет, какие пользователи могут выполнять действия согласования.</w:t>
       </w:r>
     </w:p>
     <w:p>
@@ -257,12 +262,12 @@
         <w:pStyle w:val="Heading1"/>
       </w:pPr>
       <w:r>
-        <w:t>4. Описание реализованного модуля согласования документов</w:t>
+        <w:t>4. Описание реализованного модуля</w:t>
       </w:r>
     </w:p>
     <w:p>
       <w:r>
-        <w:t>В проект добавлен сервис ApprovalService, который реализует бизнес-логику согласования документов. Сервис проверяет существование документа, роль пользователя и допустимость перехода между статусами.</w:t>
+        <w:t>В проект был добавлен сервис ApprovalService. Он реализует отправку документа на согласование, утверждение и отклонение документа. Перед выполнением операции сервис проверяет существование документа, текущий статус и роль пользователя.</w:t>
       </w:r>
     </w:p>
     <w:tbl>
@@ -273,15 +278,14 @@
         <w:tblLook w:firstColumn="1" w:firstRow="1" w:lastColumn="0" w:lastRow="0" w:noHBand="0" w:noVBand="1" w:val="04A0"/>
       </w:tblPr>
       <w:tblGrid>
-        <w:gridCol w:w="2160"/>
-        <w:gridCol w:w="2160"/>
-        <w:gridCol w:w="2160"/>
-        <w:gridCol w:w="2160"/>
+        <w:gridCol w:w="2880"/>
+        <w:gridCol w:w="2880"/>
+        <w:gridCol w:w="2880"/>
       </w:tblGrid>
       <w:tr>
         <w:tc>
           <w:tcPr>
-            <w:tcW w:type="dxa" w:w="2160"/>
+            <w:tcW w:type="dxa" w:w="2880"/>
           </w:tcPr>
           <w:p>
             <w:r>
@@ -291,31 +295,21 @@
         </w:tc>
         <w:tc>
           <w:tcPr>
-            <w:tcW w:type="dxa" w:w="2160"/>
+            <w:tcW w:type="dxa" w:w="2880"/>
           </w:tcPr>
           <w:p>
             <w:r>
-              <w:t>Начальный статус</w:t>
+              <w:t>Переход статуса</w:t>
             </w:r>
           </w:p>
         </w:tc>
         <w:tc>
           <w:tcPr>
-            <w:tcW w:type="dxa" w:w="2160"/>
+            <w:tcW w:type="dxa" w:w="2880"/>
           </w:tcPr>
           <w:p>
             <w:r>
-              <w:t>Итоговый статус</w:t>
-            </w:r>
-          </w:p>
-        </w:tc>
-        <w:tc>
-          <w:tcPr>
-            <w:tcW w:type="dxa" w:w="2160"/>
-          </w:tcPr>
-          <w:p>
-            <w:r>
-              <w:t>Роли</w:t>
+              <w:t>Разрешенные роли</w:t>
             </w:r>
           </w:p>
         </w:tc>
@@ -323,7 +317,7 @@
       <w:tr>
         <w:tc>
           <w:tcPr>
-            <w:tcW w:type="dxa" w:w="2160"/>
+            <w:tcW w:type="dxa" w:w="2880"/>
           </w:tcPr>
           <w:p>
             <w:r>
@@ -333,27 +327,17 @@
         </w:tc>
         <w:tc>
           <w:tcPr>
-            <w:tcW w:type="dxa" w:w="2160"/>
+            <w:tcW w:type="dxa" w:w="2880"/>
           </w:tcPr>
           <w:p>
             <w:r>
-              <w:t>DRAFT</w:t>
+              <w:t>DRAFT -&gt; PENDING</w:t>
             </w:r>
           </w:p>
         </w:tc>
         <w:tc>
           <w:tcPr>
-            <w:tcW w:type="dxa" w:w="2160"/>
-          </w:tcPr>
-          <w:p>
-            <w:r>
-              <w:t>PENDING</w:t>
-            </w:r>
-          </w:p>
-        </w:tc>
-        <w:tc>
-          <w:tcPr>
-            <w:tcW w:type="dxa" w:w="2160"/>
+            <w:tcW w:type="dxa" w:w="2880"/>
           </w:tcPr>
           <w:p>
             <w:r>
@@ -365,7 +349,7 @@
       <w:tr>
         <w:tc>
           <w:tcPr>
-            <w:tcW w:type="dxa" w:w="2160"/>
+            <w:tcW w:type="dxa" w:w="2880"/>
           </w:tcPr>
           <w:p>
             <w:r>
@@ -375,27 +359,17 @@
         </w:tc>
         <w:tc>
           <w:tcPr>
-            <w:tcW w:type="dxa" w:w="2160"/>
+            <w:tcW w:type="dxa" w:w="2880"/>
           </w:tcPr>
           <w:p>
             <w:r>
-              <w:t>PENDING</w:t>
+              <w:t>PENDING -&gt; APPROVED</w:t>
             </w:r>
           </w:p>
         </w:tc>
         <w:tc>
           <w:tcPr>
-            <w:tcW w:type="dxa" w:w="2160"/>
-          </w:tcPr>
-          <w:p>
-            <w:r>
-              <w:t>APPROVED</w:t>
-            </w:r>
-          </w:p>
-        </w:tc>
-        <w:tc>
-          <w:tcPr>
-            <w:tcW w:type="dxa" w:w="2160"/>
+            <w:tcW w:type="dxa" w:w="2880"/>
           </w:tcPr>
           <w:p>
             <w:r>
@@ -407,7 +381,7 @@
       <w:tr>
         <w:tc>
           <w:tcPr>
-            <w:tcW w:type="dxa" w:w="2160"/>
+            <w:tcW w:type="dxa" w:w="2880"/>
           </w:tcPr>
           <w:p>
             <w:r>
@@ -417,27 +391,17 @@
         </w:tc>
         <w:tc>
           <w:tcPr>
-            <w:tcW w:type="dxa" w:w="2160"/>
+            <w:tcW w:type="dxa" w:w="2880"/>
           </w:tcPr>
           <w:p>
             <w:r>
-              <w:t>PENDING</w:t>
+              <w:t>PENDING -&gt; REJECTED</w:t>
             </w:r>
           </w:p>
         </w:tc>
         <w:tc>
           <w:tcPr>
-            <w:tcW w:type="dxa" w:w="2160"/>
-          </w:tcPr>
-          <w:p>
-            <w:r>
-              <w:t>REJECTED</w:t>
-            </w:r>
-          </w:p>
-        </w:tc>
-        <w:tc>
-          <w:tcPr>
-            <w:tcW w:type="dxa" w:w="2160"/>
+            <w:tcW w:type="dxa" w:w="2880"/>
           </w:tcPr>
           <w:p>
             <w:r>
@@ -450,7 +414,7 @@
     <w:p/>
     <w:p>
       <w:r>
-        <w:t>Некорректные переходы запрещаются. Например, нельзя утвердить документ в статусе DRAFT и нельзя повторно отправить на согласование уже утвержденный документ.</w:t>
+        <w:t>Некорректные переходы запрещаются. Например, документ в статусе DRAFT нельзя утвердить или отклонить, а утвержденный документ нельзя повторно отправить на согласование без отдельной бизнес-операции.</w:t>
       </w:r>
     </w:p>
     <w:p>
@@ -458,7 +422,7 @@
         <w:pStyle w:val="Heading1"/>
       </w:pPr>
       <w:r>
-        <w:t>5. Описание измененных и созданных файлов</w:t>
+        <w:t>5. Созданные и измененные файлы</w:t>
       </w:r>
     </w:p>
     <w:tbl>
@@ -511,7 +475,7 @@
           </w:tcPr>
           <w:p>
             <w:r>
-              <w:t>Новый сервис согласования документов</w:t>
+              <w:t>Сервис согласования документов</w:t>
             </w:r>
           </w:p>
         </w:tc>
@@ -533,7 +497,7 @@
           </w:tcPr>
           <w:p>
             <w:r>
-              <w:t>Добавлены типы ролей, действий согласования и результата операции</w:t>
+              <w:t>Типы ролей, действий согласования и результата операции</w:t>
             </w:r>
           </w:p>
         </w:tc>
@@ -555,7 +519,7 @@
           </w:tcPr>
           <w:p>
             <w:r>
-              <w:t>Добавлен метод обновления статуса документа</w:t>
+              <w:t>Метод обновления статуса документа</w:t>
             </w:r>
           </w:p>
         </w:tc>
@@ -577,7 +541,7 @@
           </w:tcPr>
           <w:p>
             <w:r>
-              <w:t>Реализовано обновление статуса и запись события в историю версий</w:t>
+              <w:t>Сохранение нового статуса и записи в истории версий</w:t>
             </w:r>
           </w:p>
         </w:tc>
@@ -599,7 +563,7 @@
           </w:tcPr>
           <w:p>
             <w:r>
-              <w:t>Добавлены юнит- и интеграционные тесты модуля</w:t>
+              <w:t>Тесты для модуля согласования</w:t>
             </w:r>
           </w:p>
         </w:tc>
@@ -621,7 +585,7 @@
           </w:tcPr>
           <w:p>
             <w:r>
-              <w:t>Добавлен CI/CD pipeline для запуска тестов</w:t>
+              <w:t>Workflow для автоматического запуска тестов</w:t>
             </w:r>
           </w:p>
         </w:tc>
@@ -643,7 +607,7 @@
           </w:tcPr>
           <w:p>
             <w:r>
-              <w:t>Обновлено описание проекта, модуля и команд запуска</w:t>
+              <w:t>Описание проекта, команд запуска и тестирования</w:t>
             </w:r>
           </w:p>
         </w:tc>
@@ -655,12 +619,12 @@
         <w:pStyle w:val="Heading1"/>
       </w:pPr>
       <w:r>
-        <w:t>6. Применение принципов чистого кода</w:t>
+        <w:t>6. Принципы чистого кода</w:t>
       </w:r>
     </w:p>
     <w:p>
       <w:r>
-        <w:t>При реализации были применены принципы чистого кода: понятные имена методов, разделение ответственности, отсутствие дублирования проверок, единый формат ошибок и минимальные изменения существующей архитектуры проекта.</w:t>
+        <w:t>При реализации модуля были использованы понятные имена методов и переменных, разделение ответственности и централизованное хранение правил переходов. Бизнес-логика находится в сервисе, а сохранение данных выполняется через репозиторий.</w:t>
       </w:r>
     </w:p>
     <w:p>
@@ -668,7 +632,7 @@
         <w:pStyle w:val="ListBullet"/>
       </w:pPr>
       <w:r>
-        <w:t>Методы submitForApproval, approveDocument и rejectDocument отражают бизнес-действия предметной области.</w:t>
+        <w:t>Методы submitForApproval, approveDocument и rejectDocument соответствуют действиям предметной области.</w:t>
       </w:r>
     </w:p>
     <w:p>
@@ -676,7 +640,7 @@
         <w:pStyle w:val="ListBullet"/>
       </w:pPr>
       <w:r>
-        <w:t>Проверка ролей вынесена в отдельный метод ensureReviewerRole.</w:t>
+        <w:t>Проверка ролей вынесена в отдельный метод.</w:t>
       </w:r>
     </w:p>
     <w:p>
@@ -684,7 +648,7 @@
         <w:pStyle w:val="ListBullet"/>
       </w:pPr>
       <w:r>
-        <w:t>Проверка допустимых переходов вынесена в метод ensureTransitionAllowed.</w:t>
+        <w:t>Проверка допустимых переходов между статусами выполняется централизованно.</w:t>
       </w:r>
     </w:p>
     <w:p>
@@ -692,15 +656,7 @@
         <w:pStyle w:val="ListBullet"/>
       </w:pPr>
       <w:r>
-        <w:t>Карта переходов APPROVAL_TRANSITIONS централизует правила изменения статусов.</w:t>
-      </w:r>
-    </w:p>
-    <w:p>
-      <w:pPr>
-        <w:pStyle w:val="ListBullet"/>
-      </w:pPr>
-      <w:r>
-        <w:t>Репозиторий отвечает только за сохранение изменений в SQLite.</w:t>
+        <w:t>Повторяющаяся логика формирования результата операции не дублируется.</w:t>
       </w:r>
     </w:p>
     <w:p>
@@ -713,12 +669,12 @@
     </w:p>
     <w:p>
       <w:r>
-        <w:t>В модуле применен паттерн State. Документ проходит через несколько состояний: DRAFT, PENDING, APPROVED, REJECTED и ARCHIVED. Для каждого действия определены допустимые исходные состояния и конечный статус.</w:t>
+        <w:t>В работе применен паттерн State. Документ может находиться в состояниях DRAFT, PENDING, APPROVED, REJECTED и ARCHIVED. Для операций согласования определены допустимые переходы между состояниями.</w:t>
       </w:r>
     </w:p>
     <w:p>
       <w:r>
-        <w:t>Применение State позволяет не разбрасывать проверки статусов по разным частям проекта, а хранить правила переходов централизованно в ApprovalService.</w:t>
+        <w:t>Такой подход подходит для СЭД, потому что жизненный цикл документа зависит от текущего статуса. Централизация правил переходов упрощает сопровождение и снижает риск ошибок при расширении модуля.</w:t>
       </w:r>
     </w:p>
     <w:p>
@@ -726,48 +682,12 @@
         <w:pStyle w:val="Heading1"/>
       </w:pPr>
       <w:r>
-        <w:t>8. Работа с Git</w:t>
+        <w:t>8. Работа с Git и GitHub</w:t>
       </w:r>
     </w:p>
     <w:p>
       <w:r>
-        <w:t>В рабочей среде команда git была недоступна через PATH, а стандартные пути C:\Program Files\Git\cmd\git.exe и C:\Program Files\Git\bin\git.exe также не найдены. Поэтому коммиты не были выполнены автоматически.</w:t>
-      </w:r>
-    </w:p>
-    <w:p>
-      <w:r>
-        <w:t>После установки Git for Windows или добавления Git в PATH необходимо выполнить команды: git init, git add ., git commit -m "feat: add document approval service", git commit -m "test: add approval module tests", git commit -m "ci: add automated test workflow", git commit -m "docs: update README and lab reports".</w:t>
-      </w:r>
-    </w:p>
-    <w:p>
-      <w:r>
-        <w:t>Ссылка на GitHub: [Ссылка на репозиторий GitHub]</w:t>
-      </w:r>
-    </w:p>
-    <w:p>
-      <w:pPr>
-        <w:pStyle w:val="Heading1"/>
-      </w:pPr>
-      <w:r>
-        <w:t>9. README</w:t>
-      </w:r>
-    </w:p>
-    <w:p>
-      <w:r>
-        <w:t>README проекта был обновлен. В нем описаны назначение проекта, реализованный модуль согласования документов, статусы документа, установка зависимостей, запуск проекта, запуск тестов, покрытие и CI/CD pipeline.</w:t>
-      </w:r>
-    </w:p>
-    <w:p>
-      <w:pPr>
-        <w:pStyle w:val="Heading1"/>
-      </w:pPr>
-      <w:r>
-        <w:t>10. Code review</w:t>
-      </w:r>
-    </w:p>
-    <w:p>
-      <w:r>
-        <w:t>Так как реальное совместное review в рамках выполнения работы не проводилось, выполнена учебная имитация code review реализованного модуля.</w:t>
+        <w:t>Проект был оформлен как Git-репозиторий. Были выполнены осмысленные коммиты, отражающие этапы разработки: реализация модуля, добавление тестов, настройка CI/CD и обновление документации.</w:t>
       </w:r>
     </w:p>
     <w:tbl>
@@ -788,7 +708,161 @@
           </w:tcPr>
           <w:p>
             <w:r>
-              <w:t>Комментарий</w:t>
+              <w:t>Коммит</w:t>
+            </w:r>
+          </w:p>
+        </w:tc>
+        <w:tc>
+          <w:tcPr>
+            <w:tcW w:type="dxa" w:w="4320"/>
+          </w:tcPr>
+          <w:p>
+            <w:r>
+              <w:t>Назначение</w:t>
+            </w:r>
+          </w:p>
+        </w:tc>
+      </w:tr>
+      <w:tr>
+        <w:tc>
+          <w:tcPr>
+            <w:tcW w:type="dxa" w:w="4320"/>
+          </w:tcPr>
+          <w:p>
+            <w:r>
+              <w:t>feat: add document approval service</w:t>
+            </w:r>
+          </w:p>
+        </w:tc>
+        <w:tc>
+          <w:tcPr>
+            <w:tcW w:type="dxa" w:w="4320"/>
+          </w:tcPr>
+          <w:p>
+            <w:r>
+              <w:t>Реализация модуля согласования документов</w:t>
+            </w:r>
+          </w:p>
+        </w:tc>
+      </w:tr>
+      <w:tr>
+        <w:tc>
+          <w:tcPr>
+            <w:tcW w:type="dxa" w:w="4320"/>
+          </w:tcPr>
+          <w:p>
+            <w:r>
+              <w:t>test: add approval module tests</w:t>
+            </w:r>
+          </w:p>
+        </w:tc>
+        <w:tc>
+          <w:tcPr>
+            <w:tcW w:type="dxa" w:w="4320"/>
+          </w:tcPr>
+          <w:p>
+            <w:r>
+              <w:t>Добавление тестов и результатов тестирования</w:t>
+            </w:r>
+          </w:p>
+        </w:tc>
+      </w:tr>
+      <w:tr>
+        <w:tc>
+          <w:tcPr>
+            <w:tcW w:type="dxa" w:w="4320"/>
+          </w:tcPr>
+          <w:p>
+            <w:r>
+              <w:t>ci: add automated test workflow</w:t>
+            </w:r>
+          </w:p>
+        </w:tc>
+        <w:tc>
+          <w:tcPr>
+            <w:tcW w:type="dxa" w:w="4320"/>
+          </w:tcPr>
+          <w:p>
+            <w:r>
+              <w:t>Настройка GitHub Actions</w:t>
+            </w:r>
+          </w:p>
+        </w:tc>
+      </w:tr>
+      <w:tr>
+        <w:tc>
+          <w:tcPr>
+            <w:tcW w:type="dxa" w:w="4320"/>
+          </w:tcPr>
+          <w:p>
+            <w:r>
+              <w:t>docs: update README and lab reports</w:t>
+            </w:r>
+          </w:p>
+        </w:tc>
+        <w:tc>
+          <w:tcPr>
+            <w:tcW w:type="dxa" w:w="4320"/>
+          </w:tcPr>
+          <w:p>
+            <w:r>
+              <w:t>Обновление README и отчетов</w:t>
+            </w:r>
+          </w:p>
+        </w:tc>
+      </w:tr>
+    </w:tbl>
+    <w:p/>
+    <w:p>
+      <w:r>
+        <w:t>Ссылка на репозиторий GitHub: https://github.com/haskes235-collab/software-engineering-edo-app</w:t>
+      </w:r>
+    </w:p>
+    <w:p>
+      <w:pPr>
+        <w:pStyle w:val="Heading1"/>
+      </w:pPr>
+      <w:r>
+        <w:t>9. README</w:t>
+      </w:r>
+    </w:p>
+    <w:p>
+      <w:r>
+        <w:t>В README добавлены описание проекта, реализованный модуль согласования, статусы документа, команды установки зависимостей, запуска приложения, запуска тестов и проверки покрытия.</w:t>
+      </w:r>
+    </w:p>
+    <w:p>
+      <w:pPr>
+        <w:pStyle w:val="Heading1"/>
+      </w:pPr>
+      <w:r>
+        <w:t>10. Code review</w:t>
+      </w:r>
+    </w:p>
+    <w:p>
+      <w:r>
+        <w:t>Для проверки качества реализации был выполнен учебный code review по основным критериям: читаемость, структура, корректность проверок и соответствие архитектуре проекта.</w:t>
+      </w:r>
+    </w:p>
+    <w:tbl>
+      <w:tblPr>
+        <w:tblStyle w:val="TableGrid"/>
+        <w:tblW w:type="auto" w:w="0"/>
+        <w:jc w:val="center"/>
+        <w:tblLook w:firstColumn="1" w:firstRow="1" w:lastColumn="0" w:lastRow="0" w:noHBand="0" w:noVBand="1" w:val="04A0"/>
+      </w:tblPr>
+      <w:tblGrid>
+        <w:gridCol w:w="4320"/>
+        <w:gridCol w:w="4320"/>
+      </w:tblGrid>
+      <w:tr>
+        <w:tc>
+          <w:tcPr>
+            <w:tcW w:type="dxa" w:w="4320"/>
+          </w:tcPr>
+          <w:p>
+            <w:r>
+              <w:t>Комментарий review</w:t>
             </w:r>
           </w:p>
         </w:tc>
@@ -810,7 +884,7 @@
           </w:tcPr>
           <w:p>
             <w:r>
-              <w:t>Проверить, что утверждать и отклонять документ может только руководитель или администратор.</w:t>
+              <w:t>Переходы статусов должны быть собраны в одном месте.</w:t>
             </w:r>
           </w:p>
         </w:tc>
@@ -820,7 +894,7 @@
           </w:tcPr>
           <w:p>
             <w:r>
-              <w:t>Добавлена проверка ролей в ensureReviewerRole и тест на запрет утверждения сотрудником.</w:t>
+              <w:t>Правила переходов вынесены в карту APPROVAL_TRANSITIONS.</w:t>
             </w:r>
           </w:p>
         </w:tc>
@@ -832,7 +906,7 @@
           </w:tcPr>
           <w:p>
             <w:r>
-              <w:t>Проверить, что переходы статусов не разбросаны по коду.</w:t>
+              <w:t>Утверждение и отклонение должны быть доступны только руководителю и администратору.</w:t>
             </w:r>
           </w:p>
         </w:tc>
@@ -842,7 +916,7 @@
           </w:tcPr>
           <w:p>
             <w:r>
-              <w:t>Переходы вынесены в единую карту APPROVAL_TRANSITIONS.</w:t>
+              <w:t>Добавлена проверка ролей перед выполнением операции.</w:t>
             </w:r>
           </w:p>
         </w:tc>
@@ -854,7 +928,7 @@
           </w:tcPr>
           <w:p>
             <w:r>
-              <w:t>Добавить фиксацию изменения статуса в истории документа.</w:t>
+              <w:t>Изменение статуса должно фиксироваться в истории.</w:t>
             </w:r>
           </w:p>
         </w:tc>
@@ -864,7 +938,7 @@
           </w:tcPr>
           <w:p>
             <w:r>
-              <w:t>Метод updateStatus сохраняет запись в document_versions с описанием действия.</w:t>
+              <w:t>В updateStatus добавлена запись changeNote в историю версий.</w:t>
             </w:r>
           </w:p>
         </w:tc>
@@ -886,7 +960,7 @@
     </w:p>
     <w:p>
       <w:r>
-        <w:t>Чистый код — это код, который легко читать, проверять, сопровождать и изменять. При разработке были применены понятные имена методов, короткие функции, разделение ответственности, отсутствие дублирования и единая обработка ошибок.</w:t>
+        <w:t>Чистый код — это код, который легко читать, проверять, сопровождать и изменять. При разработке были применены понятные имена методов, короткие функции, разделение ответственности и отсутствие дублирования.</w:t>
       </w:r>
     </w:p>
     <w:p>
@@ -896,7 +970,7 @@
     </w:p>
     <w:p>
       <w:r>
-        <w:t>Чистый код снижает количество ошибок, ускоряет code review, облегчает передачу задач между участниками команды и упрощает дальнейшее расширение системы.</w:t>
+        <w:t>Чистый код ускоряет понимание проекта, упрощает code review, снижает количество ошибок и облегчает дальнейшее расширение системы.</w:t>
       </w:r>
     </w:p>
     <w:p>
@@ -906,7 +980,7 @@
     </w:p>
     <w:p>
       <w:r>
-        <w:t>Использован паттерн State. Он подходит, потому что документ меняет состояние по заданным правилам: DRAFT переходит в PENDING, PENDING — в APPROVED или REJECTED.</w:t>
+        <w:t>Использован паттерн State, потому что документ проходит через несколько состояний, а операции согласования зависят от текущего статуса.</w:t>
       </w:r>
     </w:p>
     <w:p>
@@ -916,7 +990,7 @@
     </w:p>
     <w:p>
       <w:r>
-        <w:t>Паттерны проектирования решают локальные задачи проектирования классов и объектов, а архитектурные шаблоны описывают общую структуру системы и взаимодействие крупных компонентов.</w:t>
+        <w:t>Паттерны проектирования решают локальные задачи взаимодействия классов и объектов, а архитектурные шаблоны описывают общую структуру системы.</w:t>
       </w:r>
     </w:p>
     <w:p>
@@ -926,7 +1000,7 @@
     </w:p>
     <w:p>
       <w:r>
-        <w:t>Существуют порождающие паттерны, например Factory Method и Singleton; структурные, например Adapter и Facade; поведенческие, например State, Strategy и Observer.</w:t>
+        <w:t>Существуют порождающие, структурные и поведенческие паттерны. Примеры: Factory Method, Adapter, Facade, State, Strategy, Observer.</w:t>
       </w:r>
     </w:p>
     <w:p>
@@ -936,7 +1010,7 @@
     </w:p>
     <w:p>
       <w:r>
-        <w:t>Git хранит историю изменений проекта в виде коммитов. Для работы используются команды git init, git status, git add, git commit, git remote и git push. В текущей среде Git был недоступен, поэтому команды подготовлены для ручного выполнения.</w:t>
+        <w:t>Git хранит историю изменений проекта в виде коммитов. В работе использовались git init, git add, git commit, git branch, git remote и git push.</w:t>
       </w:r>
     </w:p>
     <w:p>
@@ -946,7 +1020,7 @@
     </w:p>
     <w:p>
       <w:r>
-        <w:t>Git — это система контроля версий, а GitHub — платформа для хранения репозиториев, совместной разработки, pull request, issues и CI/CD через GitHub Actions.</w:t>
+        <w:t>Git — это система контроля версий, а GitHub — платформа для размещения репозиториев, совместной разработки, pull request и автоматизации через GitHub Actions.</w:t>
       </w:r>
     </w:p>
     <w:p>
@@ -956,7 +1030,7 @@
     </w:p>
     <w:p>
       <w:r>
-        <w:t>Code review — это проверка кода другим разработчиком. Оно нужно для поиска ошибок, улучшения читаемости и соблюдения командных стандартов. Проводить review нужно предметно, корректно и с конкретными рекомендациями.</w:t>
+        <w:t>Code review — это проверка кода другим разработчиком. Оно помогает находить ошибки, улучшать читаемость и поддерживать единый стиль проекта.</w:t>
       </w:r>
     </w:p>
     <w:p>
@@ -966,7 +1040,7 @@
     </w:p>
     <w:p>
       <w:r>
-        <w:t>В учебной проверке были отмечены необходимость централизовать правила переходов статусов, добавить проверку ролей и сохранять историю изменения статуса.</w:t>
+        <w:t>В ходе учебной проверки были отмечены улучшения: централизовать переходы статусов, явно проверять роли и фиксировать изменение статуса в истории.</w:t>
       </w:r>
     </w:p>
     <w:p>
@@ -976,7 +1050,7 @@
     </w:p>
     <w:p>
       <w:r>
-        <w:t>Основная трудность была связана с ограничениями окружения: Git недоступен, а npm test через стандартный wrapper выдавал Access is denied. Тесты были запущены напрямую через node.exe и vitest.mjs, а команды Git подготовлены для ручного выполнения.</w:t>
+        <w:t>Основная сложность состояла в корректном разделении бизнес-логики и доступа к данным. Она была решена через отдельный сервис ApprovalService и метод updateStatus в репозитории.</w:t>
       </w:r>
     </w:p>
     <w:p>
@@ -989,12 +1063,12 @@
     </w:p>
     <w:p>
       <w:r>
-        <w:t>В ходе выполнения лабораторной работы был реализован модуль согласования документов для системы электронного документооборота. Модуль поддерживает отправку документа на согласование, утверждение и отклонение, проверяет роли пользователей и запрещает некорректные переходы статусов.</w:t>
+        <w:t>В ходе лабораторной работы был реализован модуль согласования документов для системы электронного документооборота. Модуль поддерживает отправку документа на согласование, утверждение и отклонение, проверяет роли пользователей и запрещает некорректные переходы статусов.</w:t>
       </w:r>
     </w:p>
     <w:p>
       <w:r>
-        <w:t>Для реализации был применен паттерн State. Также был обновлен README, добавлены тесты и подготовлена настройка CI/CD.</w:t>
+        <w:t>Для реализации был применен паттерн State. Проект оформлен в Git-репозиторий, опубликован на GitHub и дополнен README, тестами и CI/CD workflow.</w:t>
       </w:r>
     </w:p>
     <w:sectPr>

</xml_diff>